<commit_message>
Rapport et présentation retravaillés (skills docx/pptx/rapport)
- Deck redessiné : structure sombre/clair, motif marge rouge, Georgia,
  chiffres clés, flux de sécurisation numéroté, numéros de diapositive.
- Rapport : titres Georgia encre, filet rouge de couverture, lien GitHub.
- Ajout des skills docx, pptx et rapport (pipeline de génération documenté).
</commit_message>
<xml_diff>
--- a/docs/Rapport_Projet.docx
+++ b/docs/Rapport_Projet.docx
@@ -13,11 +13,27 @@
       </w:pPr>
       <w:r>
         <w:rPr>
+          <w:rFonts w:ascii="Georgia" w:hAnsi="Georgia"/>
           <w:b/>
-          <w:sz w:val="64"/>
+          <w:color w:val="16213A"/>
+          <w:sz w:val="80"/>
         </w:rPr>
         <w:t>EChallenge</w:t>
-        <w:br/>
+      </w:r>
+    </w:p>
+    <w:p>
+      <w:pPr>
+        <w:jc w:val="center"/>
+        <w:pBdr>
+          <w:bottom w:val="single" w:sz="18" w:color="D8432F"/>
+        </w:pBdr>
+      </w:pPr>
+      <w:r>
+        <w:rPr>
+          <w:rFonts w:ascii="Georgia" w:hAnsi="Georgia"/>
+          <w:color w:val="16213A"/>
+          <w:sz w:val="40"/>
+        </w:rPr>
         <w:t>Plateforme d'examens en ligne</w:t>
       </w:r>
     </w:p>
@@ -27,7 +43,7 @@
       </w:pPr>
       <w:r>
         <w:rPr>
-          <w:sz w:val="36"/>
+          <w:sz w:val="32"/>
         </w:rPr>
         <w:br/>
         <w:t>Rapport de Projet de Fin de Module</w:t>
@@ -41,7 +57,7 @@
       </w:pPr>
       <w:r>
         <w:rPr>
-          <w:sz w:val="26"/>
+          <w:sz w:val="24"/>
         </w:rPr>
         <w:br/>
         <w:br/>
@@ -104,7 +120,7 @@
     </w:p>
     <w:p>
       <w:r>
-        <w:t>Ce rapport est organisé en trois chapitres : le premier analyse les besoins et délimite le périmètre du projet ; le deuxième présente la conception (architecture technique et diagrammes de classes UML) ; le troisième décrit la réalisation, la sécurisation et illustre l'application par des captures d'écran. Une conclusion dresse le bilan et ouvre des perspectives.</w:t>
+        <w:t>Ce rapport est organisé en trois chapitres : le premier analyse les besoins et délimite le périmètre du projet ; le deuxième présente la conception (architecture technique et diagramme de classes UML) ; le troisième décrit la réalisation, la sécurisation et illustre l'application par des captures d'écran. Une conclusion dresse le bilan et ouvre des perspectives.</w:t>
       </w:r>
     </w:p>
     <w:p>
@@ -326,6 +342,7 @@
       <w:r>
         <w:rPr>
           <w:i/>
+          <w:sz w:val="20"/>
         </w:rPr>
         <w:t>Figure 1 — Architecture technique de l'application</w:t>
       </w:r>
@@ -389,6 +406,7 @@
       <w:r>
         <w:rPr>
           <w:i/>
+          <w:sz w:val="20"/>
         </w:rPr>
         <w:t>Figure 2 — Diagramme de classes : entités du domaine</w:t>
       </w:r>
@@ -581,7 +599,7 @@
           </w:tcPr>
           <w:p>
             <w:r>
-              <w:t>Maven, Docker Compose, JUnit 5, PlantUML</w:t>
+              <w:t>Maven, Docker Compose, PlantUML</w:t>
             </w:r>
           </w:p>
         </w:tc>
@@ -729,6 +747,7 @@
       <w:r>
         <w:rPr>
           <w:i/>
+          <w:sz w:val="20"/>
         </w:rPr>
         <w:t>Capture — Tableau de bord administrateur</w:t>
       </w:r>
@@ -779,6 +798,7 @@
       <w:r>
         <w:rPr>
           <w:i/>
+          <w:sz w:val="20"/>
         </w:rPr>
         <w:t>Capture — Gestion des questions (options et bonnes réponses)</w:t>
       </w:r>
@@ -829,6 +849,7 @@
       <w:r>
         <w:rPr>
           <w:i/>
+          <w:sz w:val="20"/>
         </w:rPr>
         <w:t>Capture — Gestion des créneaux</w:t>
       </w:r>
@@ -879,6 +900,7 @@
       <w:r>
         <w:rPr>
           <w:i/>
+          <w:sz w:val="20"/>
         </w:rPr>
         <w:t>Capture — Suivi des sessions</w:t>
       </w:r>
@@ -929,6 +951,7 @@
       <w:r>
         <w:rPr>
           <w:i/>
+          <w:sz w:val="20"/>
         </w:rPr>
         <w:t>Capture — Tous les résultats</w:t>
       </w:r>
@@ -979,6 +1002,7 @@
       <w:r>
         <w:rPr>
           <w:i/>
+          <w:sz w:val="20"/>
         </w:rPr>
         <w:t>Capture — Message d'erreur métier (créneau réservé)</w:t>
       </w:r>
@@ -1037,6 +1061,7 @@
       <w:r>
         <w:rPr>
           <w:i/>
+          <w:sz w:val="20"/>
         </w:rPr>
         <w:t>Capture — Page d'accueil publique et catalogue des tests</w:t>
       </w:r>
@@ -1087,6 +1112,7 @@
       <w:r>
         <w:rPr>
           <w:i/>
+          <w:sz w:val="20"/>
         </w:rPr>
         <w:t>Capture — Connexion (pré-remplie, comptes de démonstration)</w:t>
       </w:r>
@@ -1137,6 +1163,7 @@
       <w:r>
         <w:rPr>
           <w:i/>
+          <w:sz w:val="20"/>
         </w:rPr>
         <w:t>Capture — Inscription à un test sur un créneau</w:t>
       </w:r>
@@ -1187,6 +1214,7 @@
       <w:r>
         <w:rPr>
           <w:i/>
+          <w:sz w:val="20"/>
         </w:rPr>
         <w:t>Capture — Passage d'un test (chronomètre, questions aléatoires)</w:t>
       </w:r>
@@ -1237,6 +1265,7 @@
       <w:r>
         <w:rPr>
           <w:i/>
+          <w:sz w:val="20"/>
         </w:rPr>
         <w:t>Capture — Copie rendue : score immédiat</w:t>
       </w:r>
@@ -1287,6 +1316,7 @@
       <w:r>
         <w:rPr>
           <w:i/>
+          <w:sz w:val="20"/>
         </w:rPr>
         <w:t>Capture — Historique des résultats du candidat</w:t>
       </w:r>
@@ -1337,6 +1367,7 @@
       <w:r>
         <w:rPr>
           <w:i/>
+          <w:sz w:val="20"/>
         </w:rPr>
         <w:t>Capture — Résultat en échec</w:t>
       </w:r>
@@ -1351,7 +1382,7 @@
     </w:p>
     <w:p>
       <w:r>
-        <w:t>Les étapes d'installation (Docker, Maven, npm) et les comptes de démonstration (admin@echallenge.com / admin123 et candidat@echallenge.com / candidat123, créés automatiquement au démarrage) sont détaillés dans le fichier README.md. La base de données est fournie dans database/ : echallenge.sql (export complet) et seed-data.sql (jeu de démonstration).</w:t>
+        <w:t>Les étapes d'installation (Docker, Maven, npm) et les comptes de démonstration (admin@echallenge.com / admin123 et candidat@echallenge.com / candidat123, créés automatiquement au démarrage) sont détaillés dans le fichier README.md. La base de données est fournie dans database/ : echallenge.sql (export complet) et seed-data.sql (jeu de démonstration). Le code source complet est disponible sur https://github.com/mehdiaichouch2002/echallenge.</w:t>
       </w:r>
     </w:p>
     <w:p>
@@ -1808,6 +1839,9 @@
     <w:name w:val="Normal"/>
     <w:qFormat/>
     <w:rsid w:val="00FC693F"/>
+    <w:rPr>
+      <w:sz w:val="22"/>
+    </w:rPr>
   </w:style>
   <w:style w:type="paragraph" w:styleId="Header">
     <w:name w:val="header"/>
@@ -1868,11 +1902,11 @@
       <w:outlineLvl w:val="0"/>
     </w:pPr>
     <w:rPr>
-      <w:rFonts w:asciiTheme="majorHAnsi" w:eastAsiaTheme="majorEastAsia" w:hAnsiTheme="majorHAnsi" w:cstheme="majorBidi"/>
+      <w:rFonts w:asciiTheme="majorHAnsi" w:eastAsiaTheme="majorEastAsia" w:hAnsiTheme="majorHAnsi" w:cstheme="majorBidi" w:ascii="Georgia" w:hAnsi="Georgia"/>
       <w:b/>
       <w:bCs/>
-      <w:color w:val="365F91" w:themeColor="accent1" w:themeShade="BF"/>
-      <w:sz w:val="28"/>
+      <w:color w:val="16213A"/>
+      <w:sz w:val="34"/>
       <w:szCs w:val="28"/>
     </w:rPr>
   </w:style>
@@ -1892,11 +1926,11 @@
       <w:outlineLvl w:val="1"/>
     </w:pPr>
     <w:rPr>
-      <w:rFonts w:asciiTheme="majorHAnsi" w:eastAsiaTheme="majorEastAsia" w:hAnsiTheme="majorHAnsi" w:cstheme="majorBidi"/>
+      <w:rFonts w:asciiTheme="majorHAnsi" w:eastAsiaTheme="majorEastAsia" w:hAnsiTheme="majorHAnsi" w:cstheme="majorBidi" w:ascii="Georgia" w:hAnsi="Georgia"/>
       <w:b/>
       <w:bCs/>
-      <w:color w:val="4F81BD" w:themeColor="accent1"/>
-      <w:sz w:val="26"/>
+      <w:color w:val="16213A"/>
+      <w:sz w:val="27"/>
       <w:szCs w:val="26"/>
     </w:rPr>
   </w:style>

</xml_diff>

<commit_message>
Rapport et présentation : date au format mois/année (07/2026)
</commit_message>
<xml_diff>
--- a/docs/Rapport_Projet.docx
+++ b/docs/Rapport_Projet.docx
@@ -67,7 +67,7 @@
         <w:br/>
         <w:t>Année universitaire : 2025 / 2026</w:t>
         <w:br/>
-        <w:t>Date : 12/07/2026</w:t>
+        <w:t>Date : 07/2026</w:t>
       </w:r>
     </w:p>
     <w:p>
@@ -635,6 +635,14 @@
       </w:pPr>
       <w:r>
         <w:t>Autorisation par rôle : /api/auth/** public, GET /api/tests et /api/themes publics, /api/admin/** réservé à ADMIN, /api/candidate/** réservé à CANDIDATE.</w:t>
+      </w:r>
+    </w:p>
+    <w:p>
+      <w:pPr>
+        <w:pStyle w:val="ListBullet"/>
+      </w:pPr>
+      <w:r>
+        <w:t>Jeton absent ou expiré : réponse 401 et retour automatique à la page de connexion ; rôle insuffisant : réponse 403.</w:t>
       </w:r>
     </w:p>
     <w:p>
@@ -1382,7 +1390,7 @@
     </w:p>
     <w:p>
       <w:r>
-        <w:t>Les étapes d'installation (Docker, Maven, npm) et les comptes de démonstration (admin@echallenge.com / admin123 et candidat@echallenge.com / candidat123, créés automatiquement au démarrage) sont détaillés dans le fichier README.md. La base de données est fournie dans database/ : echallenge.sql (export complet) et seed-data.sql (jeu de démonstration). Le code source complet est disponible sur https://github.com/mehdiaichouch2002/echallenge.</w:t>
+        <w:t>Les étapes d'installation (Docker, Maven, npm) et les comptes de démonstration (admin@echallenge.com / admin123 et candidat@echallenge.com / candidat123, créés automatiquement au démarrage) sont détaillés dans le fichier README.md. La base de données est fournie dans database/ : echallenge.sql (export complet) et seed-data.sql (jeu de démonstration). Une vidéo de démonstration du parcours complet est fournie dans docs/demo/. Le code source complet est disponible sur https://github.com/mehdiaichouch2002/echallenge.</w:t>
       </w:r>
     </w:p>
     <w:p>

</xml_diff>

<commit_message>
Rapport et présentation : encadrante Pr. Meryem Amane
</commit_message>
<xml_diff>
--- a/docs/Rapport_Projet.docx
+++ b/docs/Rapport_Projet.docx
@@ -63,7 +63,7 @@
         <w:br/>
         <w:t>Réalisé par : Mehdi Aichouch</w:t>
         <w:br/>
-        <w:t>Encadré par : ____________________</w:t>
+        <w:t>Encadré par : Pr. Meryem Amane</w:t>
         <w:br/>
         <w:t>Année universitaire : 2025 / 2026</w:t>
         <w:br/>
@@ -1390,7 +1390,7 @@
     </w:p>
     <w:p>
       <w:r>
-        <w:t>Les étapes d'installation (Docker, Maven, npm) et les comptes de démonstration (admin@echallenge.com / admin123 et candidat@echallenge.com / candidat123, créés automatiquement au démarrage) sont détaillés dans le fichier README.md. La base de données est fournie dans database/ : echallenge.sql (export complet) et seed-data.sql (jeu de démonstration). Une vidéo de démonstration du parcours complet est fournie dans docs/demo/. Le code source complet est disponible sur https://github.com/mehdiaichouch2002/echallenge.</w:t>
+        <w:t>Les étapes d'installation (Docker, Maven, npm) et les comptes de démonstration (admin@echallenge.com / admin123 et candidat@echallenge.com / candidat123, créés automatiquement au démarrage) sont détaillés dans le fichier README.md. La base de données est fournie dans database/ : echallenge.sql (export complet) et seed-data.sql (jeu de démonstration). Une vidéo de démonstration du parcours complet accompagne ce livrable. Le code source complet est disponible sur https://github.com/mehdiaichouch2002/echallenge.</w:t>
       </w:r>
     </w:p>
     <w:p>

</xml_diff>